<commit_message>
Part 1 rewritten: 6 items, noun/adjective form errors + inversion errors (Not only / Only by / Never)
</commit_message>
<xml_diff>
--- a/Lesson 4 - Cleft sentences (Teacher's).docx
+++ b/Lesson 4 - Cleft sentences (Teacher's).docx
@@ -101,7 +101,7 @@
         <w:rPr>
           <w:rFonts w:cs="Times New Roman"/>
         </w:rPr>
-        <w:t xml:space="preserve">Each sentence contains TWO errors: one in a noun form (nominalisation) and one in subject–verb agreement. Proofread the sentences.</w:t>
+        <w:t xml:space="preserve">Each sentence contains TWO errors: one in the form of a word (noun or adjective) and one in an inverted structure. Proofread the sentences.</w:t>
       </w:r>
     </w:p>
     <w:tbl>
@@ -131,7 +131,7 @@
               <w:rPr>
                 <w:rFonts w:cs="Times New Roman"/>
               </w:rPr>
-              <w:t xml:space="preserve">The school’s decide to ban mobile phones in class has reduced distraction, which make lessons easier for teachers.</w:t>
+              <w:t xml:space="preserve">Not only the new canteen is convenient for students, but the convenient of its location also draws staff at lunchtime.</w:t>
             </w:r>
           </w:p>
         </w:tc>
@@ -154,7 +154,7 @@
               <w:rPr>
                 <w:rFonts w:cs="Times New Roman"/>
               </w:rPr>
-              <w:t xml:space="preserve">Many parents worry about young people’s rely on smartphones, because these devices distracts them from their homework.</w:t>
+              <w:t xml:space="preserve">Only by eating breakfast students can keep their energy up, yet many teenagers do not realise the important of a proper diet.</w:t>
             </w:r>
           </w:p>
         </w:tc>
@@ -177,7 +177,7 @@
               <w:rPr>
                 <w:rFonts w:cs="Times New Roman"/>
               </w:rPr>
-              <w:t xml:space="preserve">The improve of online security has protected customers, but some banks still refuses to warn them about scams.</w:t>
+              <w:t xml:space="preserve">Never the school has displayed its old photographs in the hall, although the significant of that history is obvious to former students.</w:t>
             </w:r>
           </w:p>
         </w:tc>
@@ -200,7 +200,7 @@
               <w:rPr>
                 <w:rFonts w:cs="Times New Roman"/>
               </w:rPr>
-              <w:t xml:space="preserve">Students should show aware of the risks of sharing personal information online, because careless posts spreads quickly among their classmates.</w:t>
+              <w:t xml:space="preserve">Only by allowing customers to post honest reviews shops can prove the authentic of their products.</w:t>
             </w:r>
           </w:p>
         </w:tc>
@@ -223,7 +223,30 @@
               <w:rPr>
                 <w:rFonts w:cs="Times New Roman"/>
               </w:rPr>
-              <w:t xml:space="preserve">The government’s refuse to control social media companies has led to a rise in online scams, which worry many parents.</w:t>
+              <w:t xml:space="preserve">Not only losing sleep affects students’ test results, but the lose of concentration in class is also a serious problem.</w:t>
+            </w:r>
+          </w:p>
+        </w:tc>
+      </w:tr>
+      <w:tr>
+        <w:tc>
+          <w:tcPr>
+            <w:tcW w:w="9350" w:type="dxa"/>
+          </w:tcPr>
+          <w:p>
+            <w:pPr>
+              <w:pStyle w:val="ListParagraph"/>
+              <w:numPr>
+                <w:ilvl w:val="0"/>
+                <w:numId w:val="10"/>
+              </w:numPr>
+              <w:spacing w:before="240" w:line="276" w:lineRule="auto"/>
+            </w:pPr>
+            <w:r>
+              <w:rPr>
+                <w:rFonts w:cs="Times New Roman"/>
+              </w:rPr>
+              <w:t xml:space="preserve">Never students should feel afraid of making mistakes when they speak English, because the confident to speak comes from practice.</w:t>
             </w:r>
           </w:p>
         </w:tc>
@@ -313,7 +336,7 @@
               <w:rPr>
                 <w:rFonts w:cs="Times New Roman"/>
               </w:rPr>
-              <w:t xml:space="preserve">The school’s decision to ban mobile phones in class has reduced distraction, which makes lessons easier for teachers. (decide → decision — a noun is needed after ‘the school’s’; make → makes — ‘which’ refers to the whole idea of reduced distraction.)</w:t>
+              <w:t xml:space="preserve">Not only is the new canteen convenient for students, but the convenience of its location also draws staff at lunchtime. (Move is before the subject — ‘Not only’ inverts the subject and the verb; convenient → convenience — a noun is needed after ‘the’.)</w:t>
             </w:r>
           </w:p>
         </w:tc>
@@ -343,7 +366,7 @@
               <w:rPr>
                 <w:rFonts w:cs="Times New Roman"/>
               </w:rPr>
-              <w:t xml:space="preserve">Many parents worry about young people’s reliance on smartphones, because these devices distract them from their homework. (rely → reliance — the possessive needs a noun; distracts → distract — ‘these devices’ is plural.)</w:t>
+              <w:t xml:space="preserve">Only by eating breakfast can students keep their energy up, yet many teenagers do not realise the importance of a proper diet. (Move can before students — ‘Only by’ inverts; important → importance — the noun follows ‘the’.)</w:t>
             </w:r>
           </w:p>
         </w:tc>
@@ -373,7 +396,7 @@
               <w:rPr>
                 <w:rFonts w:cs="Times New Roman"/>
               </w:rPr>
-              <w:t xml:space="preserve">The improvement of online security has protected customers, but some banks still refuse to warn them about scams. (improve → improvement — ‘the … of’ needs a noun; refuses → refuse — ‘some banks’ is plural.)</w:t>
+              <w:t xml:space="preserve">Never has the school displayed its old photographs in the hall, although the significance of that history is obvious to former students. (Move has before the school — ‘Never’ inverts; significant → significance — a noun is needed after ‘the’.)</w:t>
             </w:r>
           </w:p>
         </w:tc>
@@ -403,7 +426,7 @@
               <w:rPr>
                 <w:rFonts w:cs="Times New Roman"/>
               </w:rPr>
-              <w:t xml:space="preserve">Students should show awareness of the risks of sharing personal information online, because careless posts spread quickly among their classmates. (aware → awareness — ‘show’ needs a noun; spreads → spread — ‘careless posts’ is plural.)</w:t>
+              <w:t xml:space="preserve">Only by allowing customers to post honest reviews can shops prove the authenticity of their products. (Move can before shops — ‘Only by’ inverts; authentic → authenticity — the noun follows ‘the’.)</w:t>
             </w:r>
           </w:p>
         </w:tc>
@@ -433,7 +456,37 @@
               <w:rPr>
                 <w:rFonts w:cs="Times New Roman"/>
               </w:rPr>
-              <w:t xml:space="preserve">The government’s refusal to control social media companies has led to a rise in online scams, which worries many parents. (refuse → refusal — the possessive needs a noun; worry → worries — ‘which’ refers to the whole rise in online scams.)</w:t>
+              <w:t xml:space="preserve">Not only does losing sleep affect students’ test results, but the loss of concentration in class is also a serious problem. (Add does before the subject and use the base verb affect — ‘Not only’ inverts; lose → loss — a noun is needed after ‘the’.)</w:t>
+            </w:r>
+          </w:p>
+        </w:tc>
+      </w:tr>
+      <w:tr>
+        <w:tc>
+          <w:tcPr>
+            <w:tcW w:w="620" w:type="dxa"/>
+            <w:shd w:val="clear" w:color="auto" w:fill="F2F2F2"/>
+          </w:tcPr>
+          <w:p>
+            <w:r>
+              <w:rPr>
+                <w:rFonts w:cs="Times New Roman"/>
+              </w:rPr>
+              <w:t xml:space="preserve">6</w:t>
+            </w:r>
+          </w:p>
+        </w:tc>
+        <w:tc>
+          <w:tcPr>
+            <w:tcW w:w="8730" w:type="dxa"/>
+            <w:shd w:val="clear" w:color="auto" w:fill="F2F2F2"/>
+          </w:tcPr>
+          <w:p>
+            <w:r>
+              <w:rPr>
+                <w:rFonts w:cs="Times New Roman"/>
+              </w:rPr>
+              <w:t xml:space="preserve">Never should students feel afraid of making mistakes when they speak English, because the confidence to speak comes from practice. (Move should before students — ‘Never’ inverts; confident → confidence — the noun follows ‘the’.)</w:t>
             </w:r>
           </w:p>
         </w:tc>

</xml_diff>

<commit_message>
Add teacher+student handouts, zip bundle, builders and QA script
</commit_message>
<xml_diff>
--- a/Lesson 4 - Cleft sentences (Teacher's).docx
+++ b/Lesson 4 - Cleft sentences (Teacher's).docx
@@ -131,7 +131,7 @@
               <w:rPr>
                 <w:rFonts w:cs="Times New Roman"/>
               </w:rPr>
-              <w:t xml:space="preserve">Not only the new canteen is convenient for students, but the convenient of its location also draws staff at lunchtime.</w:t>
+              <w:t xml:space="preserve">Not only the new canteen is convenient for students, but the convenient of its online ordering system also attracts busy teachers.</w:t>
             </w:r>
           </w:p>
         </w:tc>
@@ -200,7 +200,7 @@
               <w:rPr>
                 <w:rFonts w:cs="Times New Roman"/>
               </w:rPr>
-              <w:t xml:space="preserve">Only by allowing customers to post honest reviews shops can prove the authentic of their products.</w:t>
+              <w:t xml:space="preserve">Only by showing customers how their products are made shops can prove the authentic of their products.</w:t>
             </w:r>
           </w:p>
         </w:tc>
@@ -336,7 +336,7 @@
               <w:rPr>
                 <w:rFonts w:cs="Times New Roman"/>
               </w:rPr>
-              <w:t xml:space="preserve">Not only is the new canteen convenient for students, but the convenience of its location also draws staff at lunchtime. (Move is before the subject — ‘Not only’ inverts the subject and the verb; convenient → convenience — a noun is needed after ‘the’.)</w:t>
+              <w:t xml:space="preserve">Not only is the new canteen convenient for students, but the convenience of its online ordering system also attracts busy teachers. (Move is before the subject — ‘Not only’ inverts the subject and the verb; convenient → convenience — a noun is needed after ‘the’.)</w:t>
             </w:r>
           </w:p>
         </w:tc>
@@ -426,7 +426,7 @@
               <w:rPr>
                 <w:rFonts w:cs="Times New Roman"/>
               </w:rPr>
-              <w:t xml:space="preserve">Only by allowing customers to post honest reviews can shops prove the authenticity of their products. (Move can before shops — ‘Only by’ inverts; authentic → authenticity — the noun follows ‘the’.)</w:t>
+              <w:t xml:space="preserve">Only by showing customers how their products are made can shops prove the authenticity of their products. (Move can before shops — ‘Only by’ inverts; authentic → authenticity — the noun follows ‘the’.)</w:t>
             </w:r>
           </w:p>
         </w:tc>
@@ -637,7 +637,7 @@
               <w:rPr>
                 <w:rFonts w:cs="Times New Roman"/>
               </w:rPr>
-              <w:t xml:space="preserve">2. It ___ the fear of being left out that pushes teenagers to join in.</w:t>
+              <w:t xml:space="preserve">2. It ___ the promise of a quick laugh that makes cruel posts so tempting to share.</w:t>
             </w:r>
           </w:p>
         </w:tc>
@@ -677,7 +677,7 @@
               <w:rPr>
                 <w:rFonts w:cs="Times New Roman"/>
               </w:rPr>
-              <w:t xml:space="preserve">3. It was the school’s slow response ___ allowed the bullying to continue.</w:t>
+              <w:t xml:space="preserve">3. It was the school newspaper ___ first reported the story.</w:t>
             </w:r>
           </w:p>
         </w:tc>
@@ -717,7 +717,7 @@
               <w:rPr>
                 <w:rFonts w:cs="Times New Roman"/>
               </w:rPr>
-              <w:t xml:space="preserve">4. ___ drives teenagers to join in online bullying is the fear of being left out.</w:t>
+              <w:t xml:space="preserve">4. ___ drives a teenager to keep scrolling is the fear of missing out.</w:t>
             </w:r>
           </w:p>
         </w:tc>
@@ -757,7 +757,7 @@
               <w:rPr>
                 <w:rFonts w:cs="Times New Roman"/>
               </w:rPr>
-              <w:t xml:space="preserve">5. It is teachers ___ first notice how quickly cruel comments spread.</w:t>
+              <w:t xml:space="preserve">5. It is teachers ___ first notice the change in a student’s behaviour.</w:t>
             </w:r>
           </w:p>
         </w:tc>
@@ -797,7 +797,7 @@
               <w:rPr>
                 <w:rFonts w:cs="Times New Roman"/>
               </w:rPr>
-              <w:t xml:space="preserve">6. All the school needs to do ___ provide a safe place to report abuse.</w:t>
+              <w:t xml:space="preserve">6. All the school needs to do ___ train staff to spot the warning signs.</w:t>
             </w:r>
           </w:p>
         </w:tc>
@@ -917,7 +917,7 @@
               <w:rPr>
                 <w:rFonts w:cs="Times New Roman"/>
               </w:rPr>
-              <w:t xml:space="preserve">9. It was not ___ a student left the school that the bullying was taken seriously.</w:t>
+              <w:t xml:space="preserve">9. It was not ___ parents complained to the principal that the bullying was investigated.</w:t>
             </w:r>
           </w:p>
         </w:tc>
@@ -957,7 +957,7 @@
               <w:rPr>
                 <w:rFonts w:cs="Times New Roman"/>
               </w:rPr>
-              <w:t xml:space="preserve">10. What worries counsellors most ___ the speed at which cruel posts travel.</w:t>
+              <w:t xml:space="preserve">10. What worries counsellors most ___ the silence of the students who see it happen.</w:t>
             </w:r>
           </w:p>
         </w:tc>
@@ -1157,7 +1157,7 @@
               <w:rPr>
                 <w:rFonts w:cs="Times New Roman"/>
               </w:rPr>
-              <w:t xml:space="preserve">15. ___ struck the teachers most was how quickly the story spread across the year.</w:t>
+              <w:t xml:space="preserve">15. ___ struck the teachers most was how fast a single post can reach the whole year group.</w:t>
             </w:r>
           </w:p>
         </w:tc>
@@ -1277,7 +1277,7 @@
               <w:rPr>
                 <w:rFonts w:cs="Times New Roman"/>
               </w:rPr>
-              <w:t xml:space="preserve">18. It is the school’s silence ___ allows online bullying to continue.</w:t>
+              <w:t xml:space="preserve">18. It is one trusted adult, more than any new policy, ___ makes the biggest difference to a victim.</w:t>
             </w:r>
           </w:p>
         </w:tc>
@@ -1317,7 +1317,7 @@
               <w:rPr>
                 <w:rFonts w:cs="Times New Roman"/>
               </w:rPr>
-              <w:t xml:space="preserve">19. ___ matters most is how quickly a school responds when a victim reports abuse.</w:t>
+              <w:t xml:space="preserve">19. ___ matters most is that victims know someone is on their side.</w:t>
             </w:r>
           </w:p>
         </w:tc>
@@ -1357,7 +1357,7 @@
               <w:rPr>
                 <w:rFonts w:cs="Times New Roman"/>
               </w:rPr>
-              <w:t xml:space="preserve">20. It is one trusted adult, more than any new policy, ___ makes the biggest difference to a victim.</w:t>
+              <w:t xml:space="preserve">20. It is the way a school responds ___ decides whether victims ever report again.</w:t>
             </w:r>
           </w:p>
         </w:tc>
@@ -1572,7 +1572,7 @@
         <w:rPr>
           <w:rFonts w:cs="Times New Roman"/>
         </w:rPr>
-        <w:t xml:space="preserve">It is anonymity that encourages people to post cruel comments. Behind a screen, nobody has to see the person they are hurting, so the usual checks of a real conversation disappear. Asking students to use their own names on the school forum would remove that cover entirely.</w:t>
+        <w:t xml:space="preserve">It is anonymity that encourages people to post cruel comments. Behind a screen, nobody has to face the person they are hurting, so the usual restraint of a face-to-face conversation disappears. Asking students to use their own names on the school forum would remove that cover entirely.</w:t>
       </w:r>
     </w:p>
     <w:p>
@@ -1754,7 +1754,7 @@
               <w:rPr>
                 <w:rFonts w:cs="Times New Roman"/>
               </w:rPr>
-              <w:t xml:space="preserve">What the school must do is make it easier for victims to report bullying.</w:t>
+              <w:t xml:space="preserve">What the school should do is make it easier for victims to report bullying.</w:t>
             </w:r>
           </w:p>
         </w:tc>
@@ -1774,7 +1774,7 @@
         <w:rPr>
           <w:rFonts w:cs="Times New Roman"/>
         </w:rPr>
-        <w:t xml:space="preserve">What the school must do is make it easier for victims to report bullying. One anonymous form on the school website would take an afternoon to set up. Once students know that a report will be read, the silence that protects bullies begins to disappear.</w:t>
+        <w:t xml:space="preserve">What the school should do is make it easier for victims to report bullying. One anonymous form on the school website would take an afternoon to set up. Once students know that a report will be read, the silence that protects bullies begins to disappear.</w:t>
       </w:r>
     </w:p>
     <w:p>
@@ -1875,7 +1875,7 @@
         <w:rPr>
           <w:rFonts w:cs="Times New Roman"/>
         </w:rPr>
-        <w:t xml:space="preserve">All the school has to do is post one clear rule about online behaviour. A single sentence in the student handbook would tell everyone what is expected of them. Such a small step would make it far easier for victims to report what happens to them.</w:t>
+        <w:t xml:space="preserve">All the school has to do is post one clear rule about online behaviour. A single sentence in the student handbook would tell everyone what is expected of them. Such a small step would show victims that the school takes the problem seriously, and more of them would come forward.</w:t>
       </w:r>
     </w:p>
     <w:p>
@@ -1997,7 +1997,7 @@
               <w:rPr>
                 <w:rFonts w:cs="Times New Roman"/>
               </w:rPr>
-              <w:t xml:space="preserve">Teenagers only need one adult who will listen without judging them.</w:t>
+              <w:t xml:space="preserve">Most teenagers only need one adult who will listen without judging them.</w:t>
             </w:r>
           </w:p>
         </w:tc>
@@ -2587,7 +2587,7 @@
                 <w:rFonts w:cs="Times New Roman"/>
                 <w:i/>
               </w:rPr>
-              <w:t xml:space="preserve">Begin with ‘What the government must do …’.</w:t>
+              <w:t xml:space="preserve">Begin with ‘What the government should do …’.</w:t>
             </w:r>
           </w:p>
         </w:tc>
@@ -2616,7 +2616,7 @@
               <w:rPr>
                 <w:rFonts w:cs="Times New Roman"/>
               </w:rPr>
-              <w:t xml:space="preserve">What the government must do is make platforms remove cruel posts within 24 hours.</w:t>
+              <w:t xml:space="preserve">What the government should do is make platforms remove cruel posts within 24 hours.</w:t>
             </w:r>
           </w:p>
         </w:tc>
@@ -2668,7 +2668,7 @@
               <w:rPr>
                 <w:rFonts w:cs="Times New Roman"/>
               </w:rPr>
-              <w:t xml:space="preserve">To keep victims safe, the school only has to give them somewhere to go at break time.</w:t>
+              <w:t xml:space="preserve">To keep victims safe, the school only has to provide a safe place for them at break time.</w:t>
             </w:r>
           </w:p>
         </w:tc>
@@ -2726,7 +2726,7 @@
               <w:rPr>
                 <w:rFonts w:cs="Times New Roman"/>
               </w:rPr>
-              <w:t xml:space="preserve">All the school needs to do is give victims somewhere to go at break time.</w:t>
+              <w:t xml:space="preserve">All the school needs to do is provide a safe place for victims at break time.</w:t>
             </w:r>
           </w:p>
         </w:tc>
@@ -3150,7 +3150,7 @@
         <w:rPr>
           <w:rFonts w:cs="Times New Roman"/>
         </w:rPr>
-        <w:t xml:space="preserve">Escaping online bullying is hard because the abuse continues after school, and many victims never tell anyone about it. All schools really need to do is give students one trusted adult and one simple way to report cruel messages. This small change, which costs almost nothing, would help thousands of teenagers currently suffering in silence. Parents have a part to play as well, because a teenager is far more likely to speak up when someone at home takes the problem seriously.</w:t>
+        <w:t xml:space="preserve">Escaping online bullying is hard because the abuse continues after school, and many victims never tell anyone about it. All schools really need to do is give students one trusted adult and one simple way to report cruel messages. This small change, which costs almost nothing, would help thousands of teenagers currently suffering in silence. A tutor-group discussion once a month would keep the topic alive, and victims would know that the school is on their side.</w:t>
       </w:r>
     </w:p>
     <w:p>
@@ -3168,7 +3168,7 @@
         <w:rPr>
           <w:rFonts w:cs="Times New Roman"/>
         </w:rPr>
-        <w:t xml:space="preserve">Each sample uses ONE cleft: Sample 1 an it-cleft (It is … that …), Sample 2 a wh-cleft (What … is …) and Sample 3 an all-cleft (All … needs to do is …). Each sample also contains ONE relative clause (‘which’ in every case) — point these out to students before they write.</w:t>
+        <w:t xml:space="preserve">Each sample uses ONE cleft: Sample 1 an it-cleft (It is … that …), Sample 2 a wh-cleft (What … is …) and Sample 3 an all-cleft (All … need to do is …). Each sample also contains ONE relative clause (‘which’ in every case) — point these out to students before they write.</w:t>
       </w:r>
     </w:p>
     <w:sectPr>

</xml_diff>

<commit_message>
v2.1: pad sample answers to ~78 words
</commit_message>
<xml_diff>
--- a/Lesson 4 - Cleft sentences (Teacher's).docx
+++ b/Lesson 4 - Cleft sentences (Teacher's).docx
@@ -1979,7 +1979,7 @@
         <w:rPr>
           <w:rFonts w:cs="Times New Roman"/>
         </w:rPr>
-        <w:t xml:space="preserve">Artificial intelligence is changing the way students learn, but not every change is positive. It is the loss of independent thinking that worries teachers most, as too many teenagers now let apps write their essays. Schools should therefore limit AI use in homework, which would force students to develop their own ideas. A simple rule requiring a first draft without AI would restore the value of real effort.</w:t>
+        <w:t xml:space="preserve">Artificial intelligence is changing the way students learn, but not every change is positive. It is the loss of independent thinking that worries teachers most, as too many teenagers now let apps write their essays without even reading the questions first. Schools should therefore limit AI use in all homework tasks, which would force students to develop their own ideas and opinions. A simple rule requiring a first draft without AI would restore the value of real effort.</w:t>
       </w:r>
     </w:p>
     <w:p>
@@ -2005,7 +2005,7 @@
         <w:rPr>
           <w:rFonts w:cs="Times New Roman"/>
         </w:rPr>
-        <w:t xml:space="preserve">What concerns parents most is that their children are losing the ability to think for themselves. Artificial intelligence can answer almost any question instantly, so students no longer wrestle with difficult problems on their own. Schools should require students to complete at least one draft without any AI assistance, which would teach them the patience that genuine learning demands. Only then will they understand that struggle is not failure but the beginning of real growth.</w:t>
+        <w:t xml:space="preserve">What concerns parents most is that their children are losing the ability to think for themselves. Artificial intelligence can answer almost any question instantly, so students no longer wrestle with difficult problems on their own. Schools should require students to complete at least one draft without any AI assistance of any kind, which would teach them the patience that genuine learning demands. Only then will they understand that struggle is not failure but the beginning of real growth.</w:t>
       </w:r>
     </w:p>
     <w:p>
@@ -2031,7 +2031,7 @@
         <w:rPr>
           <w:rFonts w:cs="Times New Roman"/>
         </w:rPr>
-        <w:t xml:space="preserve">All schools need to do is teach students how to use AI as a tool rather than a replacement for thinking. Many teenagers now trust an app more than their own judgment, which means they never develop the confidence to solve problems alone. A short lesson on verifying AI answers with real sources would show students that intelligence is not about speed but about understanding. This small change could transform the way they approach every subject.</w:t>
+        <w:t xml:space="preserve">All schools need to do is teach students how to use AI as a tool rather than a replacement for thinking. Many teenagers now trust an app more than their own judgment, which means they never develop the confidence to solve problems alone. A short practical lesson on verifying AI answers with real sources would show students that true intelligence is not about speed but about understanding. This small change could transform the way they approach every subject.</w:t>
       </w:r>
     </w:p>
     <w:p>

</xml_diff>